<commit_message>
Our project push to github
</commit_message>
<xml_diff>
--- a/Report/Project_Report.docx
+++ b/Report/Project_Report.docx
@@ -489,7 +489,13 @@
         <w:rPr>
           <w:color w:val="2C1A0E"/>
         </w:rPr>
-        <w:t xml:space="preserve"> Bite — Single-Page Application &amp; Responsive Website</w:t>
+        <w:t xml:space="preserve"> Bite -</w:t>
+      </w:r>
+      <w:r>
+        <w:rPr>
+          <w:color w:val="2C1A0E"/>
+        </w:rPr>
+        <w:t xml:space="preserve"> Single-Page Application &amp; Responsive Website</w:t>
       </w:r>
     </w:p>
     <w:p>
@@ -924,12 +930,6 @@
         <w:gridCol w:w="6240"/>
       </w:tblGrid>
       <w:tr>
-        <w:tblPrEx>
-          <w:tblCellMar>
-            <w:top w:w="0" w:type="dxa"/>
-            <w:bottom w:w="0" w:type="dxa"/>
-          </w:tblCellMar>
-        </w:tblPrEx>
         <w:tc>
           <w:tcPr>
             <w:tcW w:w="3120" w:type="dxa"/>
@@ -989,12 +989,6 @@
         </w:tc>
       </w:tr>
       <w:tr>
-        <w:tblPrEx>
-          <w:tblCellMar>
-            <w:top w:w="0" w:type="dxa"/>
-            <w:bottom w:w="0" w:type="dxa"/>
-          </w:tblCellMar>
-        </w:tblPrEx>
         <w:tc>
           <w:tcPr>
             <w:tcW w:w="3120" w:type="dxa"/>
@@ -1054,12 +1048,6 @@
         </w:tc>
       </w:tr>
       <w:tr>
-        <w:tblPrEx>
-          <w:tblCellMar>
-            <w:top w:w="0" w:type="dxa"/>
-            <w:bottom w:w="0" w:type="dxa"/>
-          </w:tblCellMar>
-        </w:tblPrEx>
         <w:tc>
           <w:tcPr>
             <w:tcW w:w="3120" w:type="dxa"/>
@@ -1138,12 +1126,6 @@
         </w:tc>
       </w:tr>
       <w:tr>
-        <w:tblPrEx>
-          <w:tblCellMar>
-            <w:top w:w="0" w:type="dxa"/>
-            <w:bottom w:w="0" w:type="dxa"/>
-          </w:tblCellMar>
-        </w:tblPrEx>
         <w:tc>
           <w:tcPr>
             <w:tcW w:w="3120" w:type="dxa"/>
@@ -1197,18 +1179,12 @@
                 <w:sz w:val="19"/>
                 <w:szCs w:val="19"/>
               </w:rPr>
-              <w:t>Vanilla JavaScript (ES6+), DOM Manipulation, Fetch API</w:t>
+              <w:t>JavaScript (ES6+), DOM Manipulation, Fetch API</w:t>
             </w:r>
           </w:p>
         </w:tc>
       </w:tr>
       <w:tr>
-        <w:tblPrEx>
-          <w:tblCellMar>
-            <w:top w:w="0" w:type="dxa"/>
-            <w:bottom w:w="0" w:type="dxa"/>
-          </w:tblCellMar>
-        </w:tblPrEx>
         <w:tc>
           <w:tcPr>
             <w:tcW w:w="3120" w:type="dxa"/>
@@ -1298,18 +1274,12 @@
                 <w:sz w:val="19"/>
                 <w:szCs w:val="19"/>
               </w:rPr>
-              <w:t xml:space="preserve"> (visitor counter)</w:t>
+              <w:t xml:space="preserve"> </w:t>
             </w:r>
           </w:p>
         </w:tc>
       </w:tr>
       <w:tr>
-        <w:tblPrEx>
-          <w:tblCellMar>
-            <w:top w:w="0" w:type="dxa"/>
-            <w:bottom w:w="0" w:type="dxa"/>
-          </w:tblCellMar>
-        </w:tblPrEx>
         <w:tc>
           <w:tcPr>
             <w:tcW w:w="3120" w:type="dxa"/>
@@ -1405,12 +1375,6 @@
         </w:tc>
       </w:tr>
       <w:tr>
-        <w:tblPrEx>
-          <w:tblCellMar>
-            <w:top w:w="0" w:type="dxa"/>
-            <w:bottom w:w="0" w:type="dxa"/>
-          </w:tblCellMar>
-        </w:tblPrEx>
         <w:tc>
           <w:tcPr>
             <w:tcW w:w="3120" w:type="dxa"/>
@@ -1506,12 +1470,6 @@
         </w:tc>
       </w:tr>
       <w:tr>
-        <w:tblPrEx>
-          <w:tblCellMar>
-            <w:top w:w="0" w:type="dxa"/>
-            <w:bottom w:w="0" w:type="dxa"/>
-          </w:tblCellMar>
-        </w:tblPrEx>
         <w:tc>
           <w:tcPr>
             <w:tcW w:w="3120" w:type="dxa"/>
@@ -1581,12 +1539,6 @@
         </w:tc>
       </w:tr>
       <w:tr>
-        <w:tblPrEx>
-          <w:tblCellMar>
-            <w:top w:w="0" w:type="dxa"/>
-            <w:bottom w:w="0" w:type="dxa"/>
-          </w:tblCellMar>
-        </w:tblPrEx>
         <w:tc>
           <w:tcPr>
             <w:tcW w:w="3120" w:type="dxa"/>
@@ -1656,12 +1608,6 @@
         </w:tc>
       </w:tr>
       <w:tr>
-        <w:tblPrEx>
-          <w:tblCellMar>
-            <w:top w:w="0" w:type="dxa"/>
-            <w:bottom w:w="0" w:type="dxa"/>
-          </w:tblCellMar>
-        </w:tblPrEx>
         <w:tc>
           <w:tcPr>
             <w:tcW w:w="3120" w:type="dxa"/>
@@ -2307,12 +2253,6 @@
         <w:gridCol w:w="7920"/>
       </w:tblGrid>
       <w:tr>
-        <w:tblPrEx>
-          <w:tblCellMar>
-            <w:top w:w="0" w:type="dxa"/>
-            <w:bottom w:w="0" w:type="dxa"/>
-          </w:tblCellMar>
-        </w:tblPrEx>
         <w:tc>
           <w:tcPr>
             <w:tcW w:w="1440" w:type="dxa"/>
@@ -2372,12 +2312,6 @@
         </w:tc>
       </w:tr>
       <w:tr>
-        <w:tblPrEx>
-          <w:tblCellMar>
-            <w:top w:w="0" w:type="dxa"/>
-            <w:bottom w:w="0" w:type="dxa"/>
-          </w:tblCellMar>
-        </w:tblPrEx>
         <w:tc>
           <w:tcPr>
             <w:tcW w:w="1440" w:type="dxa"/>
@@ -2437,12 +2371,6 @@
         </w:tc>
       </w:tr>
       <w:tr>
-        <w:tblPrEx>
-          <w:tblCellMar>
-            <w:top w:w="0" w:type="dxa"/>
-            <w:bottom w:w="0" w:type="dxa"/>
-          </w:tblCellMar>
-        </w:tblPrEx>
         <w:tc>
           <w:tcPr>
             <w:tcW w:w="1440" w:type="dxa"/>
@@ -2503,12 +2431,6 @@
         </w:tc>
       </w:tr>
       <w:tr>
-        <w:tblPrEx>
-          <w:tblCellMar>
-            <w:top w:w="0" w:type="dxa"/>
-            <w:bottom w:w="0" w:type="dxa"/>
-          </w:tblCellMar>
-        </w:tblPrEx>
         <w:tc>
           <w:tcPr>
             <w:tcW w:w="1440" w:type="dxa"/>
@@ -2568,12 +2490,6 @@
         </w:tc>
       </w:tr>
       <w:tr>
-        <w:tblPrEx>
-          <w:tblCellMar>
-            <w:top w:w="0" w:type="dxa"/>
-            <w:bottom w:w="0" w:type="dxa"/>
-          </w:tblCellMar>
-        </w:tblPrEx>
         <w:tc>
           <w:tcPr>
             <w:tcW w:w="1440" w:type="dxa"/>
@@ -2651,12 +2567,6 @@
         </w:tc>
       </w:tr>
       <w:tr>
-        <w:tblPrEx>
-          <w:tblCellMar>
-            <w:top w:w="0" w:type="dxa"/>
-            <w:bottom w:w="0" w:type="dxa"/>
-          </w:tblCellMar>
-        </w:tblPrEx>
         <w:tc>
           <w:tcPr>
             <w:tcW w:w="1440" w:type="dxa"/>
@@ -2716,12 +2626,6 @@
         </w:tc>
       </w:tr>
       <w:tr>
-        <w:tblPrEx>
-          <w:tblCellMar>
-            <w:top w:w="0" w:type="dxa"/>
-            <w:bottom w:w="0" w:type="dxa"/>
-          </w:tblCellMar>
-        </w:tblPrEx>
         <w:tc>
           <w:tcPr>
             <w:tcW w:w="1440" w:type="dxa"/>
@@ -2799,12 +2703,6 @@
         </w:tc>
       </w:tr>
       <w:tr>
-        <w:tblPrEx>
-          <w:tblCellMar>
-            <w:top w:w="0" w:type="dxa"/>
-            <w:bottom w:w="0" w:type="dxa"/>
-          </w:tblCellMar>
-        </w:tblPrEx>
         <w:tc>
           <w:tcPr>
             <w:tcW w:w="1440" w:type="dxa"/>
@@ -2880,12 +2778,6 @@
         </w:tc>
       </w:tr>
       <w:tr>
-        <w:tblPrEx>
-          <w:tblCellMar>
-            <w:top w:w="0" w:type="dxa"/>
-            <w:bottom w:w="0" w:type="dxa"/>
-          </w:tblCellMar>
-        </w:tblPrEx>
         <w:tc>
           <w:tcPr>
             <w:tcW w:w="1440" w:type="dxa"/>
@@ -2945,12 +2837,6 @@
         </w:tc>
       </w:tr>
       <w:tr>
-        <w:tblPrEx>
-          <w:tblCellMar>
-            <w:top w:w="0" w:type="dxa"/>
-            <w:bottom w:w="0" w:type="dxa"/>
-          </w:tblCellMar>
-        </w:tblPrEx>
         <w:tc>
           <w:tcPr>
             <w:tcW w:w="1440" w:type="dxa"/>
@@ -3010,12 +2896,6 @@
         </w:tc>
       </w:tr>
       <w:tr>
-        <w:tblPrEx>
-          <w:tblCellMar>
-            <w:top w:w="0" w:type="dxa"/>
-            <w:bottom w:w="0" w:type="dxa"/>
-          </w:tblCellMar>
-        </w:tblPrEx>
         <w:tc>
           <w:tcPr>
             <w:tcW w:w="1440" w:type="dxa"/>
@@ -3075,12 +2955,6 @@
         </w:tc>
       </w:tr>
       <w:tr>
-        <w:tblPrEx>
-          <w:tblCellMar>
-            <w:top w:w="0" w:type="dxa"/>
-            <w:bottom w:w="0" w:type="dxa"/>
-          </w:tblCellMar>
-        </w:tblPrEx>
         <w:tc>
           <w:tcPr>
             <w:tcW w:w="1440" w:type="dxa"/>
@@ -3158,12 +3032,6 @@
         </w:tc>
       </w:tr>
       <w:tr>
-        <w:tblPrEx>
-          <w:tblCellMar>
-            <w:top w:w="0" w:type="dxa"/>
-            <w:bottom w:w="0" w:type="dxa"/>
-          </w:tblCellMar>
-        </w:tblPrEx>
         <w:tc>
           <w:tcPr>
             <w:tcW w:w="1440" w:type="dxa"/>
@@ -3223,12 +3091,6 @@
         </w:tc>
       </w:tr>
       <w:tr>
-        <w:tblPrEx>
-          <w:tblCellMar>
-            <w:top w:w="0" w:type="dxa"/>
-            <w:bottom w:w="0" w:type="dxa"/>
-          </w:tblCellMar>
-        </w:tblPrEx>
         <w:tc>
           <w:tcPr>
             <w:tcW w:w="1440" w:type="dxa"/>
@@ -3306,12 +3168,6 @@
         </w:tc>
       </w:tr>
       <w:tr>
-        <w:tblPrEx>
-          <w:tblCellMar>
-            <w:top w:w="0" w:type="dxa"/>
-            <w:bottom w:w="0" w:type="dxa"/>
-          </w:tblCellMar>
-        </w:tblPrEx>
         <w:tc>
           <w:tcPr>
             <w:tcW w:w="1440" w:type="dxa"/>
@@ -3371,12 +3227,6 @@
         </w:tc>
       </w:tr>
       <w:tr>
-        <w:tblPrEx>
-          <w:tblCellMar>
-            <w:top w:w="0" w:type="dxa"/>
-            <w:bottom w:w="0" w:type="dxa"/>
-          </w:tblCellMar>
-        </w:tblPrEx>
         <w:tc>
           <w:tcPr>
             <w:tcW w:w="1440" w:type="dxa"/>
@@ -3454,12 +3304,6 @@
         </w:tc>
       </w:tr>
       <w:tr>
-        <w:tblPrEx>
-          <w:tblCellMar>
-            <w:top w:w="0" w:type="dxa"/>
-            <w:bottom w:w="0" w:type="dxa"/>
-          </w:tblCellMar>
-        </w:tblPrEx>
         <w:tc>
           <w:tcPr>
             <w:tcW w:w="1440" w:type="dxa"/>
@@ -3555,12 +3399,6 @@
         <w:gridCol w:w="7920"/>
       </w:tblGrid>
       <w:tr>
-        <w:tblPrEx>
-          <w:tblCellMar>
-            <w:top w:w="0" w:type="dxa"/>
-            <w:bottom w:w="0" w:type="dxa"/>
-          </w:tblCellMar>
-        </w:tblPrEx>
         <w:tc>
           <w:tcPr>
             <w:tcW w:w="1440" w:type="dxa"/>
@@ -3620,12 +3458,6 @@
         </w:tc>
       </w:tr>
       <w:tr>
-        <w:tblPrEx>
-          <w:tblCellMar>
-            <w:top w:w="0" w:type="dxa"/>
-            <w:bottom w:w="0" w:type="dxa"/>
-          </w:tblCellMar>
-        </w:tblPrEx>
         <w:tc>
           <w:tcPr>
             <w:tcW w:w="1440" w:type="dxa"/>
@@ -3685,12 +3517,6 @@
         </w:tc>
       </w:tr>
       <w:tr>
-        <w:tblPrEx>
-          <w:tblCellMar>
-            <w:top w:w="0" w:type="dxa"/>
-            <w:bottom w:w="0" w:type="dxa"/>
-          </w:tblCellMar>
-        </w:tblPrEx>
         <w:tc>
           <w:tcPr>
             <w:tcW w:w="1440" w:type="dxa"/>
@@ -3750,12 +3576,6 @@
         </w:tc>
       </w:tr>
       <w:tr>
-        <w:tblPrEx>
-          <w:tblCellMar>
-            <w:top w:w="0" w:type="dxa"/>
-            <w:bottom w:w="0" w:type="dxa"/>
-          </w:tblCellMar>
-        </w:tblPrEx>
         <w:tc>
           <w:tcPr>
             <w:tcW w:w="1440" w:type="dxa"/>
@@ -3815,12 +3635,6 @@
         </w:tc>
       </w:tr>
       <w:tr>
-        <w:tblPrEx>
-          <w:tblCellMar>
-            <w:top w:w="0" w:type="dxa"/>
-            <w:bottom w:w="0" w:type="dxa"/>
-          </w:tblCellMar>
-        </w:tblPrEx>
         <w:tc>
           <w:tcPr>
             <w:tcW w:w="1440" w:type="dxa"/>
@@ -3880,12 +3694,6 @@
         </w:tc>
       </w:tr>
       <w:tr>
-        <w:tblPrEx>
-          <w:tblCellMar>
-            <w:top w:w="0" w:type="dxa"/>
-            <w:bottom w:w="0" w:type="dxa"/>
-          </w:tblCellMar>
-        </w:tblPrEx>
         <w:tc>
           <w:tcPr>
             <w:tcW w:w="1440" w:type="dxa"/>
@@ -3945,12 +3753,6 @@
         </w:tc>
       </w:tr>
       <w:tr>
-        <w:tblPrEx>
-          <w:tblCellMar>
-            <w:top w:w="0" w:type="dxa"/>
-            <w:bottom w:w="0" w:type="dxa"/>
-          </w:tblCellMar>
-        </w:tblPrEx>
         <w:tc>
           <w:tcPr>
             <w:tcW w:w="1440" w:type="dxa"/>
@@ -4010,12 +3812,6 @@
         </w:tc>
       </w:tr>
       <w:tr>
-        <w:tblPrEx>
-          <w:tblCellMar>
-            <w:top w:w="0" w:type="dxa"/>
-            <w:bottom w:w="0" w:type="dxa"/>
-          </w:tblCellMar>
-        </w:tblPrEx>
         <w:tc>
           <w:tcPr>
             <w:tcW w:w="1440" w:type="dxa"/>
@@ -4093,12 +3889,6 @@
         </w:tc>
       </w:tr>
       <w:tr>
-        <w:tblPrEx>
-          <w:tblCellMar>
-            <w:top w:w="0" w:type="dxa"/>
-            <w:bottom w:w="0" w:type="dxa"/>
-          </w:tblCellMar>
-        </w:tblPrEx>
         <w:tc>
           <w:tcPr>
             <w:tcW w:w="1440" w:type="dxa"/>
@@ -5361,7 +5151,10 @@
       </w:pPr>
       <w:r>
         <w:lastRenderedPageBreak/>
-        <w:t>3.2.2 Level 1 DFD — Main Processes</w:t>
+        <w:t>3.2.2 Level 1 DFD -</w:t>
+      </w:r>
+      <w:r>
+        <w:t xml:space="preserve"> Main Processes</w:t>
       </w:r>
     </w:p>
     <w:p>
@@ -9351,12 +9144,6 @@
         <w:gridCol w:w="7360"/>
       </w:tblGrid>
       <w:tr>
-        <w:tblPrEx>
-          <w:tblCellMar>
-            <w:top w:w="0" w:type="dxa"/>
-            <w:bottom w:w="0" w:type="dxa"/>
-          </w:tblCellMar>
-        </w:tblPrEx>
         <w:tc>
           <w:tcPr>
             <w:tcW w:w="2000" w:type="dxa"/>
@@ -9416,12 +9203,6 @@
         </w:tc>
       </w:tr>
       <w:tr>
-        <w:tblPrEx>
-          <w:tblCellMar>
-            <w:top w:w="0" w:type="dxa"/>
-            <w:bottom w:w="0" w:type="dxa"/>
-          </w:tblCellMar>
-        </w:tblPrEx>
         <w:tc>
           <w:tcPr>
             <w:tcW w:w="2000" w:type="dxa"/>
@@ -9447,7 +9228,15 @@
                 <w:sz w:val="19"/>
                 <w:szCs w:val="19"/>
               </w:rPr>
-              <w:t>id</w:t>
+              <w:t>I</w:t>
+            </w:r>
+            <w:r>
+              <w:rPr>
+                <w:color w:val="2C1A0E"/>
+                <w:sz w:val="19"/>
+                <w:szCs w:val="19"/>
+              </w:rPr>
+              <w:t>d</w:t>
             </w:r>
           </w:p>
         </w:tc>
@@ -9481,12 +9270,6 @@
         </w:tc>
       </w:tr>
       <w:tr>
-        <w:tblPrEx>
-          <w:tblCellMar>
-            <w:top w:w="0" w:type="dxa"/>
-            <w:bottom w:w="0" w:type="dxa"/>
-          </w:tblCellMar>
-        </w:tblPrEx>
         <w:tc>
           <w:tcPr>
             <w:tcW w:w="2000" w:type="dxa"/>
@@ -9512,7 +9295,15 @@
                 <w:sz w:val="19"/>
                 <w:szCs w:val="19"/>
               </w:rPr>
-              <w:t>name</w:t>
+              <w:t>N</w:t>
+            </w:r>
+            <w:r>
+              <w:rPr>
+                <w:color w:val="2C1A0E"/>
+                <w:sz w:val="19"/>
+                <w:szCs w:val="19"/>
+              </w:rPr>
+              <w:t>ame</w:t>
             </w:r>
           </w:p>
         </w:tc>
@@ -9546,12 +9337,6 @@
         </w:tc>
       </w:tr>
       <w:tr>
-        <w:tblPrEx>
-          <w:tblCellMar>
-            <w:top w:w="0" w:type="dxa"/>
-            <w:bottom w:w="0" w:type="dxa"/>
-          </w:tblCellMar>
-        </w:tblPrEx>
         <w:tc>
           <w:tcPr>
             <w:tcW w:w="2000" w:type="dxa"/>
@@ -9577,7 +9362,15 @@
                 <w:sz w:val="19"/>
                 <w:szCs w:val="19"/>
               </w:rPr>
-              <w:t>price</w:t>
+              <w:t>P</w:t>
+            </w:r>
+            <w:r>
+              <w:rPr>
+                <w:color w:val="2C1A0E"/>
+                <w:sz w:val="19"/>
+                <w:szCs w:val="19"/>
+              </w:rPr>
+              <w:t>rice</w:t>
             </w:r>
           </w:p>
         </w:tc>
@@ -9611,12 +9404,6 @@
         </w:tc>
       </w:tr>
       <w:tr>
-        <w:tblPrEx>
-          <w:tblCellMar>
-            <w:top w:w="0" w:type="dxa"/>
-            <w:bottom w:w="0" w:type="dxa"/>
-          </w:tblCellMar>
-        </w:tblPrEx>
         <w:tc>
           <w:tcPr>
             <w:tcW w:w="2000" w:type="dxa"/>
@@ -9642,7 +9429,15 @@
                 <w:sz w:val="19"/>
                 <w:szCs w:val="19"/>
               </w:rPr>
-              <w:t>category</w:t>
+              <w:t>C</w:t>
+            </w:r>
+            <w:r>
+              <w:rPr>
+                <w:color w:val="2C1A0E"/>
+                <w:sz w:val="19"/>
+                <w:szCs w:val="19"/>
+              </w:rPr>
+              <w:t>ategory</w:t>
             </w:r>
           </w:p>
         </w:tc>
@@ -9676,12 +9471,6 @@
         </w:tc>
       </w:tr>
       <w:tr>
-        <w:tblPrEx>
-          <w:tblCellMar>
-            <w:top w:w="0" w:type="dxa"/>
-            <w:bottom w:w="0" w:type="dxa"/>
-          </w:tblCellMar>
-        </w:tblPrEx>
         <w:tc>
           <w:tcPr>
             <w:tcW w:w="2000" w:type="dxa"/>
@@ -9707,7 +9496,15 @@
                 <w:sz w:val="19"/>
                 <w:szCs w:val="19"/>
               </w:rPr>
-              <w:t>image</w:t>
+              <w:t>I</w:t>
+            </w:r>
+            <w:r>
+              <w:rPr>
+                <w:color w:val="2C1A0E"/>
+                <w:sz w:val="19"/>
+                <w:szCs w:val="19"/>
+              </w:rPr>
+              <w:t>mage</w:t>
             </w:r>
           </w:p>
         </w:tc>
@@ -9759,12 +9556,6 @@
         </w:tc>
       </w:tr>
       <w:tr>
-        <w:tblPrEx>
-          <w:tblCellMar>
-            <w:top w:w="0" w:type="dxa"/>
-            <w:bottom w:w="0" w:type="dxa"/>
-          </w:tblCellMar>
-        </w:tblPrEx>
         <w:tc>
           <w:tcPr>
             <w:tcW w:w="2000" w:type="dxa"/>
@@ -9790,7 +9581,15 @@
                 <w:sz w:val="19"/>
                 <w:szCs w:val="19"/>
               </w:rPr>
-              <w:t>description</w:t>
+              <w:t>D</w:t>
+            </w:r>
+            <w:r>
+              <w:rPr>
+                <w:color w:val="2C1A0E"/>
+                <w:sz w:val="19"/>
+                <w:szCs w:val="19"/>
+              </w:rPr>
+              <w:t>escription</w:t>
             </w:r>
           </w:p>
         </w:tc>
@@ -9824,12 +9623,6 @@
         </w:tc>
       </w:tr>
       <w:tr>
-        <w:tblPrEx>
-          <w:tblCellMar>
-            <w:top w:w="0" w:type="dxa"/>
-            <w:bottom w:w="0" w:type="dxa"/>
-          </w:tblCellMar>
-        </w:tblPrEx>
         <w:tc>
           <w:tcPr>
             <w:tcW w:w="2000" w:type="dxa"/>
@@ -9855,7 +9648,15 @@
                 <w:sz w:val="19"/>
                 <w:szCs w:val="19"/>
               </w:rPr>
-              <w:t>ingredients</w:t>
+              <w:t>I</w:t>
+            </w:r>
+            <w:r>
+              <w:rPr>
+                <w:color w:val="2C1A0E"/>
+                <w:sz w:val="19"/>
+                <w:szCs w:val="19"/>
+              </w:rPr>
+              <w:t>ngredients</w:t>
             </w:r>
           </w:p>
         </w:tc>
@@ -9889,12 +9690,6 @@
         </w:tc>
       </w:tr>
       <w:tr>
-        <w:tblPrEx>
-          <w:tblCellMar>
-            <w:top w:w="0" w:type="dxa"/>
-            <w:bottom w:w="0" w:type="dxa"/>
-          </w:tblCellMar>
-        </w:tblPrEx>
         <w:tc>
           <w:tcPr>
             <w:tcW w:w="2000" w:type="dxa"/>
@@ -9920,7 +9715,15 @@
                 <w:sz w:val="19"/>
                 <w:szCs w:val="19"/>
               </w:rPr>
-              <w:t>tag</w:t>
+              <w:t>T</w:t>
+            </w:r>
+            <w:r>
+              <w:rPr>
+                <w:color w:val="2C1A0E"/>
+                <w:sz w:val="19"/>
+                <w:szCs w:val="19"/>
+              </w:rPr>
+              <w:t>ag</w:t>
             </w:r>
           </w:p>
         </w:tc>
@@ -9990,12 +9793,6 @@
         <w:gridCol w:w="7360"/>
       </w:tblGrid>
       <w:tr>
-        <w:tblPrEx>
-          <w:tblCellMar>
-            <w:top w:w="0" w:type="dxa"/>
-            <w:bottom w:w="0" w:type="dxa"/>
-          </w:tblCellMar>
-        </w:tblPrEx>
         <w:tc>
           <w:tcPr>
             <w:tcW w:w="2000" w:type="dxa"/>
@@ -10055,12 +9852,6 @@
         </w:tc>
       </w:tr>
       <w:tr>
-        <w:tblPrEx>
-          <w:tblCellMar>
-            <w:top w:w="0" w:type="dxa"/>
-            <w:bottom w:w="0" w:type="dxa"/>
-          </w:tblCellMar>
-        </w:tblPrEx>
         <w:tc>
           <w:tcPr>
             <w:tcW w:w="2000" w:type="dxa"/>
@@ -10086,7 +9877,15 @@
                 <w:sz w:val="19"/>
                 <w:szCs w:val="19"/>
               </w:rPr>
-              <w:t>id</w:t>
+              <w:t>I</w:t>
+            </w:r>
+            <w:r>
+              <w:rPr>
+                <w:color w:val="2C1A0E"/>
+                <w:sz w:val="19"/>
+                <w:szCs w:val="19"/>
+              </w:rPr>
+              <w:t>d</w:t>
             </w:r>
           </w:p>
         </w:tc>
@@ -10120,12 +9919,6 @@
         </w:tc>
       </w:tr>
       <w:tr>
-        <w:tblPrEx>
-          <w:tblCellMar>
-            <w:top w:w="0" w:type="dxa"/>
-            <w:bottom w:w="0" w:type="dxa"/>
-          </w:tblCellMar>
-        </w:tblPrEx>
         <w:tc>
           <w:tcPr>
             <w:tcW w:w="2000" w:type="dxa"/>
@@ -10151,7 +9944,15 @@
                 <w:sz w:val="19"/>
                 <w:szCs w:val="19"/>
               </w:rPr>
-              <w:t>title</w:t>
+              <w:t>T</w:t>
+            </w:r>
+            <w:r>
+              <w:rPr>
+                <w:color w:val="2C1A0E"/>
+                <w:sz w:val="19"/>
+                <w:szCs w:val="19"/>
+              </w:rPr>
+              <w:t>itle</w:t>
             </w:r>
           </w:p>
         </w:tc>
@@ -10185,12 +9986,6 @@
         </w:tc>
       </w:tr>
       <w:tr>
-        <w:tblPrEx>
-          <w:tblCellMar>
-            <w:top w:w="0" w:type="dxa"/>
-            <w:bottom w:w="0" w:type="dxa"/>
-          </w:tblCellMar>
-        </w:tblPrEx>
         <w:tc>
           <w:tcPr>
             <w:tcW w:w="2000" w:type="dxa"/>
@@ -10216,7 +10011,15 @@
                 <w:sz w:val="19"/>
                 <w:szCs w:val="19"/>
               </w:rPr>
-              <w:t>discount</w:t>
+              <w:t>D</w:t>
+            </w:r>
+            <w:r>
+              <w:rPr>
+                <w:color w:val="2C1A0E"/>
+                <w:sz w:val="19"/>
+                <w:szCs w:val="19"/>
+              </w:rPr>
+              <w:t>iscount</w:t>
             </w:r>
           </w:p>
         </w:tc>
@@ -10250,12 +10053,6 @@
         </w:tc>
       </w:tr>
       <w:tr>
-        <w:tblPrEx>
-          <w:tblCellMar>
-            <w:top w:w="0" w:type="dxa"/>
-            <w:bottom w:w="0" w:type="dxa"/>
-          </w:tblCellMar>
-        </w:tblPrEx>
         <w:tc>
           <w:tcPr>
             <w:tcW w:w="2000" w:type="dxa"/>
@@ -10281,7 +10078,15 @@
                 <w:sz w:val="19"/>
                 <w:szCs w:val="19"/>
               </w:rPr>
-              <w:t>description</w:t>
+              <w:t>D</w:t>
+            </w:r>
+            <w:r>
+              <w:rPr>
+                <w:color w:val="2C1A0E"/>
+                <w:sz w:val="19"/>
+                <w:szCs w:val="19"/>
+              </w:rPr>
+              <w:t>escription</w:t>
             </w:r>
           </w:p>
         </w:tc>
@@ -10315,12 +10120,6 @@
         </w:tc>
       </w:tr>
       <w:tr>
-        <w:tblPrEx>
-          <w:tblCellMar>
-            <w:top w:w="0" w:type="dxa"/>
-            <w:bottom w:w="0" w:type="dxa"/>
-          </w:tblCellMar>
-        </w:tblPrEx>
         <w:tc>
           <w:tcPr>
             <w:tcW w:w="2000" w:type="dxa"/>
@@ -10346,7 +10145,15 @@
                 <w:sz w:val="19"/>
                 <w:szCs w:val="19"/>
               </w:rPr>
-              <w:t>validity</w:t>
+              <w:t>V</w:t>
+            </w:r>
+            <w:r>
+              <w:rPr>
+                <w:color w:val="2C1A0E"/>
+                <w:sz w:val="19"/>
+                <w:szCs w:val="19"/>
+              </w:rPr>
+              <w:t>alidity</w:t>
             </w:r>
           </w:p>
         </w:tc>
@@ -10380,12 +10187,6 @@
         </w:tc>
       </w:tr>
       <w:tr>
-        <w:tblPrEx>
-          <w:tblCellMar>
-            <w:top w:w="0" w:type="dxa"/>
-            <w:bottom w:w="0" w:type="dxa"/>
-          </w:tblCellMar>
-        </w:tblPrEx>
         <w:tc>
           <w:tcPr>
             <w:tcW w:w="2000" w:type="dxa"/>
@@ -10412,7 +10213,15 @@
                 <w:szCs w:val="19"/>
               </w:rPr>
               <w:lastRenderedPageBreak/>
-              <w:t>code</w:t>
+              <w:t>C</w:t>
+            </w:r>
+            <w:r>
+              <w:rPr>
+                <w:color w:val="2C1A0E"/>
+                <w:sz w:val="19"/>
+                <w:szCs w:val="19"/>
+              </w:rPr>
+              <w:t>ode</w:t>
             </w:r>
           </w:p>
         </w:tc>
@@ -10482,12 +10291,6 @@
         <w:gridCol w:w="7360"/>
       </w:tblGrid>
       <w:tr>
-        <w:tblPrEx>
-          <w:tblCellMar>
-            <w:top w:w="0" w:type="dxa"/>
-            <w:bottom w:w="0" w:type="dxa"/>
-          </w:tblCellMar>
-        </w:tblPrEx>
         <w:tc>
           <w:tcPr>
             <w:tcW w:w="2000" w:type="dxa"/>
@@ -10547,12 +10350,6 @@
         </w:tc>
       </w:tr>
       <w:tr>
-        <w:tblPrEx>
-          <w:tblCellMar>
-            <w:top w:w="0" w:type="dxa"/>
-            <w:bottom w:w="0" w:type="dxa"/>
-          </w:tblCellMar>
-        </w:tblPrEx>
         <w:tc>
           <w:tcPr>
             <w:tcW w:w="2000" w:type="dxa"/>
@@ -10578,7 +10375,7 @@
                 <w:sz w:val="19"/>
                 <w:szCs w:val="19"/>
               </w:rPr>
-              <w:t>q</w:t>
+              <w:t>Q</w:t>
             </w:r>
           </w:p>
         </w:tc>
@@ -10612,12 +10409,6 @@
         </w:tc>
       </w:tr>
       <w:tr>
-        <w:tblPrEx>
-          <w:tblCellMar>
-            <w:top w:w="0" w:type="dxa"/>
-            <w:bottom w:w="0" w:type="dxa"/>
-          </w:tblCellMar>
-        </w:tblPrEx>
         <w:tc>
           <w:tcPr>
             <w:tcW w:w="2000" w:type="dxa"/>
@@ -10643,7 +10434,7 @@
                 <w:sz w:val="19"/>
                 <w:szCs w:val="19"/>
               </w:rPr>
-              <w:t>a</w:t>
+              <w:t>A</w:t>
             </w:r>
           </w:p>
         </w:tc>
@@ -10738,12 +10529,6 @@
         <w:gridCol w:w="6840"/>
       </w:tblGrid>
       <w:tr>
-        <w:tblPrEx>
-          <w:tblCellMar>
-            <w:top w:w="0" w:type="dxa"/>
-            <w:bottom w:w="0" w:type="dxa"/>
-          </w:tblCellMar>
-        </w:tblPrEx>
         <w:tc>
           <w:tcPr>
             <w:tcW w:w="2520" w:type="dxa"/>
@@ -10803,12 +10588,6 @@
         </w:tc>
       </w:tr>
       <w:tr>
-        <w:tblPrEx>
-          <w:tblCellMar>
-            <w:top w:w="0" w:type="dxa"/>
-            <w:bottom w:w="0" w:type="dxa"/>
-          </w:tblCellMar>
-        </w:tblPrEx>
         <w:tc>
           <w:tcPr>
             <w:tcW w:w="2520" w:type="dxa"/>
@@ -10868,12 +10647,6 @@
         </w:tc>
       </w:tr>
       <w:tr>
-        <w:tblPrEx>
-          <w:tblCellMar>
-            <w:top w:w="0" w:type="dxa"/>
-            <w:bottom w:w="0" w:type="dxa"/>
-          </w:tblCellMar>
-        </w:tblPrEx>
         <w:tc>
           <w:tcPr>
             <w:tcW w:w="2520" w:type="dxa"/>
@@ -10987,12 +10760,6 @@
         </w:tc>
       </w:tr>
       <w:tr>
-        <w:tblPrEx>
-          <w:tblCellMar>
-            <w:top w:w="0" w:type="dxa"/>
-            <w:bottom w:w="0" w:type="dxa"/>
-          </w:tblCellMar>
-        </w:tblPrEx>
         <w:tc>
           <w:tcPr>
             <w:tcW w:w="2520" w:type="dxa"/>
@@ -11052,12 +10819,6 @@
         </w:tc>
       </w:tr>
       <w:tr>
-        <w:tblPrEx>
-          <w:tblCellMar>
-            <w:top w:w="0" w:type="dxa"/>
-            <w:bottom w:w="0" w:type="dxa"/>
-          </w:tblCellMar>
-        </w:tblPrEx>
         <w:tc>
           <w:tcPr>
             <w:tcW w:w="2520" w:type="dxa"/>
@@ -11135,12 +10896,6 @@
         </w:tc>
       </w:tr>
       <w:tr>
-        <w:tblPrEx>
-          <w:tblCellMar>
-            <w:top w:w="0" w:type="dxa"/>
-            <w:bottom w:w="0" w:type="dxa"/>
-          </w:tblCellMar>
-        </w:tblPrEx>
         <w:tc>
           <w:tcPr>
             <w:tcW w:w="2520" w:type="dxa"/>
@@ -11200,12 +10955,6 @@
         </w:tc>
       </w:tr>
       <w:tr>
-        <w:tblPrEx>
-          <w:tblCellMar>
-            <w:top w:w="0" w:type="dxa"/>
-            <w:bottom w:w="0" w:type="dxa"/>
-          </w:tblCellMar>
-        </w:tblPrEx>
         <w:tc>
           <w:tcPr>
             <w:tcW w:w="2520" w:type="dxa"/>
@@ -11265,12 +11014,6 @@
         </w:tc>
       </w:tr>
       <w:tr>
-        <w:tblPrEx>
-          <w:tblCellMar>
-            <w:top w:w="0" w:type="dxa"/>
-            <w:bottom w:w="0" w:type="dxa"/>
-          </w:tblCellMar>
-        </w:tblPrEx>
         <w:tc>
           <w:tcPr>
             <w:tcW w:w="2520" w:type="dxa"/>
@@ -11330,12 +11073,6 @@
         </w:tc>
       </w:tr>
       <w:tr>
-        <w:tblPrEx>
-          <w:tblCellMar>
-            <w:top w:w="0" w:type="dxa"/>
-            <w:bottom w:w="0" w:type="dxa"/>
-          </w:tblCellMar>
-        </w:tblPrEx>
         <w:tc>
           <w:tcPr>
             <w:tcW w:w="2520" w:type="dxa"/>
@@ -11395,12 +11132,6 @@
         </w:tc>
       </w:tr>
       <w:tr>
-        <w:tblPrEx>
-          <w:tblCellMar>
-            <w:top w:w="0" w:type="dxa"/>
-            <w:bottom w:w="0" w:type="dxa"/>
-          </w:tblCellMar>
-        </w:tblPrEx>
         <w:tc>
           <w:tcPr>
             <w:tcW w:w="2520" w:type="dxa"/>
@@ -11478,12 +11209,6 @@
         </w:tc>
       </w:tr>
       <w:tr>
-        <w:tblPrEx>
-          <w:tblCellMar>
-            <w:top w:w="0" w:type="dxa"/>
-            <w:bottom w:w="0" w:type="dxa"/>
-          </w:tblCellMar>
-        </w:tblPrEx>
         <w:tc>
           <w:tcPr>
             <w:tcW w:w="2520" w:type="dxa"/>
@@ -11545,12 +11270,6 @@
         </w:tc>
       </w:tr>
       <w:tr>
-        <w:tblPrEx>
-          <w:tblCellMar>
-            <w:top w:w="0" w:type="dxa"/>
-            <w:bottom w:w="0" w:type="dxa"/>
-          </w:tblCellMar>
-        </w:tblPrEx>
         <w:tc>
           <w:tcPr>
             <w:tcW w:w="2520" w:type="dxa"/>
@@ -11610,12 +11329,6 @@
         </w:tc>
       </w:tr>
       <w:tr>
-        <w:tblPrEx>
-          <w:tblCellMar>
-            <w:top w:w="0" w:type="dxa"/>
-            <w:bottom w:w="0" w:type="dxa"/>
-          </w:tblCellMar>
-        </w:tblPrEx>
         <w:tc>
           <w:tcPr>
             <w:tcW w:w="2520" w:type="dxa"/>
@@ -11675,12 +11388,6 @@
         </w:tc>
       </w:tr>
       <w:tr>
-        <w:tblPrEx>
-          <w:tblCellMar>
-            <w:top w:w="0" w:type="dxa"/>
-            <w:bottom w:w="0" w:type="dxa"/>
-          </w:tblCellMar>
-        </w:tblPrEx>
         <w:tc>
           <w:tcPr>
             <w:tcW w:w="2520" w:type="dxa"/>
@@ -11740,12 +11447,6 @@
         </w:tc>
       </w:tr>
       <w:tr>
-        <w:tblPrEx>
-          <w:tblCellMar>
-            <w:top w:w="0" w:type="dxa"/>
-            <w:bottom w:w="0" w:type="dxa"/>
-          </w:tblCellMar>
-        </w:tblPrEx>
         <w:tc>
           <w:tcPr>
             <w:tcW w:w="2520" w:type="dxa"/>
@@ -11805,12 +11506,6 @@
         </w:tc>
       </w:tr>
       <w:tr>
-        <w:tblPrEx>
-          <w:tblCellMar>
-            <w:top w:w="0" w:type="dxa"/>
-            <w:bottom w:w="0" w:type="dxa"/>
-          </w:tblCellMar>
-        </w:tblPrEx>
         <w:tc>
           <w:tcPr>
             <w:tcW w:w="2520" w:type="dxa"/>
@@ -11889,12 +11584,6 @@
         </w:tc>
       </w:tr>
       <w:tr>
-        <w:tblPrEx>
-          <w:tblCellMar>
-            <w:top w:w="0" w:type="dxa"/>
-            <w:bottom w:w="0" w:type="dxa"/>
-          </w:tblCellMar>
-        </w:tblPrEx>
         <w:tc>
           <w:tcPr>
             <w:tcW w:w="2520" w:type="dxa"/>
@@ -11972,12 +11661,6 @@
         </w:tc>
       </w:tr>
       <w:tr>
-        <w:tblPrEx>
-          <w:tblCellMar>
-            <w:top w:w="0" w:type="dxa"/>
-            <w:bottom w:w="0" w:type="dxa"/>
-          </w:tblCellMar>
-        </w:tblPrEx>
         <w:tc>
           <w:tcPr>
             <w:tcW w:w="2520" w:type="dxa"/>
@@ -12425,12 +12108,6 @@
         <w:gridCol w:w="7200"/>
       </w:tblGrid>
       <w:tr>
-        <w:tblPrEx>
-          <w:tblCellMar>
-            <w:top w:w="0" w:type="dxa"/>
-            <w:bottom w:w="0" w:type="dxa"/>
-          </w:tblCellMar>
-        </w:tblPrEx>
         <w:tc>
           <w:tcPr>
             <w:tcW w:w="2160" w:type="dxa"/>
@@ -12490,12 +12167,6 @@
         </w:tc>
       </w:tr>
       <w:tr>
-        <w:tblPrEx>
-          <w:tblCellMar>
-            <w:top w:w="0" w:type="dxa"/>
-            <w:bottom w:w="0" w:type="dxa"/>
-          </w:tblCellMar>
-        </w:tblPrEx>
         <w:tc>
           <w:tcPr>
             <w:tcW w:w="2160" w:type="dxa"/>
@@ -12609,12 +12280,6 @@
         </w:tc>
       </w:tr>
       <w:tr>
-        <w:tblPrEx>
-          <w:tblCellMar>
-            <w:top w:w="0" w:type="dxa"/>
-            <w:bottom w:w="0" w:type="dxa"/>
-          </w:tblCellMar>
-        </w:tblPrEx>
         <w:tc>
           <w:tcPr>
             <w:tcW w:w="2160" w:type="dxa"/>
@@ -12728,12 +12393,6 @@
         </w:tc>
       </w:tr>
       <w:tr>
-        <w:tblPrEx>
-          <w:tblCellMar>
-            <w:top w:w="0" w:type="dxa"/>
-            <w:bottom w:w="0" w:type="dxa"/>
-          </w:tblCellMar>
-        </w:tblPrEx>
         <w:tc>
           <w:tcPr>
             <w:tcW w:w="2160" w:type="dxa"/>
@@ -12865,12 +12524,6 @@
         </w:tc>
       </w:tr>
       <w:tr>
-        <w:tblPrEx>
-          <w:tblCellMar>
-            <w:top w:w="0" w:type="dxa"/>
-            <w:bottom w:w="0" w:type="dxa"/>
-          </w:tblCellMar>
-        </w:tblPrEx>
         <w:tc>
           <w:tcPr>
             <w:tcW w:w="2160" w:type="dxa"/>
@@ -15003,12 +14656,6 @@
         <w:gridCol w:w="6960"/>
       </w:tblGrid>
       <w:tr>
-        <w:tblPrEx>
-          <w:tblCellMar>
-            <w:top w:w="0" w:type="dxa"/>
-            <w:bottom w:w="0" w:type="dxa"/>
-          </w:tblCellMar>
-        </w:tblPrEx>
         <w:tc>
           <w:tcPr>
             <w:tcW w:w="2400" w:type="dxa"/>
@@ -15068,12 +14715,6 @@
         </w:tc>
       </w:tr>
       <w:tr>
-        <w:tblPrEx>
-          <w:tblCellMar>
-            <w:top w:w="0" w:type="dxa"/>
-            <w:bottom w:w="0" w:type="dxa"/>
-          </w:tblCellMar>
-        </w:tblPrEx>
         <w:tc>
           <w:tcPr>
             <w:tcW w:w="2400" w:type="dxa"/>
@@ -15151,12 +14792,6 @@
         </w:tc>
       </w:tr>
       <w:tr>
-        <w:tblPrEx>
-          <w:tblCellMar>
-            <w:top w:w="0" w:type="dxa"/>
-            <w:bottom w:w="0" w:type="dxa"/>
-          </w:tblCellMar>
-        </w:tblPrEx>
         <w:tc>
           <w:tcPr>
             <w:tcW w:w="2400" w:type="dxa"/>
@@ -15316,12 +14951,6 @@
         </w:tc>
       </w:tr>
       <w:tr>
-        <w:tblPrEx>
-          <w:tblCellMar>
-            <w:top w:w="0" w:type="dxa"/>
-            <w:bottom w:w="0" w:type="dxa"/>
-          </w:tblCellMar>
-        </w:tblPrEx>
         <w:tc>
           <w:tcPr>
             <w:tcW w:w="2400" w:type="dxa"/>
@@ -15427,12 +15056,6 @@
         </w:tc>
       </w:tr>
       <w:tr>
-        <w:tblPrEx>
-          <w:tblCellMar>
-            <w:top w:w="0" w:type="dxa"/>
-            <w:bottom w:w="0" w:type="dxa"/>
-          </w:tblCellMar>
-        </w:tblPrEx>
         <w:tc>
           <w:tcPr>
             <w:tcW w:w="2400" w:type="dxa"/>
@@ -15556,12 +15179,6 @@
         </w:tc>
       </w:tr>
       <w:tr>
-        <w:tblPrEx>
-          <w:tblCellMar>
-            <w:top w:w="0" w:type="dxa"/>
-            <w:bottom w:w="0" w:type="dxa"/>
-          </w:tblCellMar>
-        </w:tblPrEx>
         <w:tc>
           <w:tcPr>
             <w:tcW w:w="2400" w:type="dxa"/>
@@ -15621,12 +15238,6 @@
         </w:tc>
       </w:tr>
       <w:tr>
-        <w:tblPrEx>
-          <w:tblCellMar>
-            <w:top w:w="0" w:type="dxa"/>
-            <w:bottom w:w="0" w:type="dxa"/>
-          </w:tblCellMar>
-        </w:tblPrEx>
         <w:tc>
           <w:tcPr>
             <w:tcW w:w="2400" w:type="dxa"/>
@@ -15732,12 +15343,6 @@
         </w:tc>
       </w:tr>
       <w:tr>
-        <w:tblPrEx>
-          <w:tblCellMar>
-            <w:top w:w="0" w:type="dxa"/>
-            <w:bottom w:w="0" w:type="dxa"/>
-          </w:tblCellMar>
-        </w:tblPrEx>
         <w:tc>
           <w:tcPr>
             <w:tcW w:w="2400" w:type="dxa"/>
@@ -15825,12 +15430,6 @@
         </w:tc>
       </w:tr>
       <w:tr>
-        <w:tblPrEx>
-          <w:tblCellMar>
-            <w:top w:w="0" w:type="dxa"/>
-            <w:bottom w:w="0" w:type="dxa"/>
-          </w:tblCellMar>
-        </w:tblPrEx>
         <w:tc>
           <w:tcPr>
             <w:tcW w:w="2400" w:type="dxa"/>
@@ -15936,12 +15535,6 @@
         </w:tc>
       </w:tr>
       <w:tr>
-        <w:tblPrEx>
-          <w:tblCellMar>
-            <w:top w:w="0" w:type="dxa"/>
-            <w:bottom w:w="0" w:type="dxa"/>
-          </w:tblCellMar>
-        </w:tblPrEx>
         <w:tc>
           <w:tcPr>
             <w:tcW w:w="2400" w:type="dxa"/>
@@ -16001,12 +15594,6 @@
         </w:tc>
       </w:tr>
       <w:tr>
-        <w:tblPrEx>
-          <w:tblCellMar>
-            <w:top w:w="0" w:type="dxa"/>
-            <w:bottom w:w="0" w:type="dxa"/>
-          </w:tblCellMar>
-        </w:tblPrEx>
         <w:tc>
           <w:tcPr>
             <w:tcW w:w="2400" w:type="dxa"/>
@@ -16067,12 +15654,6 @@
         </w:tc>
       </w:tr>
       <w:tr>
-        <w:tblPrEx>
-          <w:tblCellMar>
-            <w:top w:w="0" w:type="dxa"/>
-            <w:bottom w:w="0" w:type="dxa"/>
-          </w:tblCellMar>
-        </w:tblPrEx>
         <w:tc>
           <w:tcPr>
             <w:tcW w:w="2400" w:type="dxa"/>
@@ -16234,12 +15815,6 @@
         </w:tc>
       </w:tr>
       <w:tr>
-        <w:tblPrEx>
-          <w:tblCellMar>
-            <w:top w:w="0" w:type="dxa"/>
-            <w:bottom w:w="0" w:type="dxa"/>
-          </w:tblCellMar>
-        </w:tblPrEx>
         <w:tc>
           <w:tcPr>
             <w:tcW w:w="2400" w:type="dxa"/>
@@ -16299,12 +15874,6 @@
         </w:tc>
       </w:tr>
       <w:tr>
-        <w:tblPrEx>
-          <w:tblCellMar>
-            <w:top w:w="0" w:type="dxa"/>
-            <w:bottom w:w="0" w:type="dxa"/>
-          </w:tblCellMar>
-        </w:tblPrEx>
         <w:tc>
           <w:tcPr>
             <w:tcW w:w="2400" w:type="dxa"/>
@@ -16364,12 +15933,6 @@
         </w:tc>
       </w:tr>
       <w:tr>
-        <w:tblPrEx>
-          <w:tblCellMar>
-            <w:top w:w="0" w:type="dxa"/>
-            <w:bottom w:w="0" w:type="dxa"/>
-          </w:tblCellMar>
-        </w:tblPrEx>
         <w:tc>
           <w:tcPr>
             <w:tcW w:w="2400" w:type="dxa"/>
@@ -16493,12 +16056,6 @@
         </w:tc>
       </w:tr>
       <w:tr>
-        <w:tblPrEx>
-          <w:tblCellMar>
-            <w:top w:w="0" w:type="dxa"/>
-            <w:bottom w:w="0" w:type="dxa"/>
-          </w:tblCellMar>
-        </w:tblPrEx>
         <w:tc>
           <w:tcPr>
             <w:tcW w:w="2400" w:type="dxa"/>
@@ -16632,12 +16189,6 @@
         </w:tc>
       </w:tr>
       <w:tr>
-        <w:tblPrEx>
-          <w:tblCellMar>
-            <w:top w:w="0" w:type="dxa"/>
-            <w:bottom w:w="0" w:type="dxa"/>
-          </w:tblCellMar>
-        </w:tblPrEx>
         <w:tc>
           <w:tcPr>
             <w:tcW w:w="2400" w:type="dxa"/>
@@ -16743,12 +16294,6 @@
         </w:tc>
       </w:tr>
       <w:tr>
-        <w:tblPrEx>
-          <w:tblCellMar>
-            <w:top w:w="0" w:type="dxa"/>
-            <w:bottom w:w="0" w:type="dxa"/>
-          </w:tblCellMar>
-        </w:tblPrEx>
         <w:tc>
           <w:tcPr>
             <w:tcW w:w="2400" w:type="dxa"/>
@@ -16898,12 +16443,6 @@
         <w:gridCol w:w="6840"/>
       </w:tblGrid>
       <w:tr>
-        <w:tblPrEx>
-          <w:tblCellMar>
-            <w:top w:w="0" w:type="dxa"/>
-            <w:bottom w:w="0" w:type="dxa"/>
-          </w:tblCellMar>
-        </w:tblPrEx>
         <w:tc>
           <w:tcPr>
             <w:tcW w:w="2520" w:type="dxa"/>
@@ -16963,12 +16502,6 @@
         </w:tc>
       </w:tr>
       <w:tr>
-        <w:tblPrEx>
-          <w:tblCellMar>
-            <w:top w:w="0" w:type="dxa"/>
-            <w:bottom w:w="0" w:type="dxa"/>
-          </w:tblCellMar>
-        </w:tblPrEx>
         <w:tc>
           <w:tcPr>
             <w:tcW w:w="2520" w:type="dxa"/>
@@ -17074,12 +16607,6 @@
         </w:tc>
       </w:tr>
       <w:tr>
-        <w:tblPrEx>
-          <w:tblCellMar>
-            <w:top w:w="0" w:type="dxa"/>
-            <w:bottom w:w="0" w:type="dxa"/>
-          </w:tblCellMar>
-        </w:tblPrEx>
         <w:tc>
           <w:tcPr>
             <w:tcW w:w="2520" w:type="dxa"/>
@@ -17149,12 +16676,6 @@
         </w:tc>
       </w:tr>
       <w:tr>
-        <w:tblPrEx>
-          <w:tblCellMar>
-            <w:top w:w="0" w:type="dxa"/>
-            <w:bottom w:w="0" w:type="dxa"/>
-          </w:tblCellMar>
-        </w:tblPrEx>
         <w:tc>
           <w:tcPr>
             <w:tcW w:w="2520" w:type="dxa"/>
@@ -17242,12 +16763,6 @@
         </w:tc>
       </w:tr>
       <w:tr>
-        <w:tblPrEx>
-          <w:tblCellMar>
-            <w:top w:w="0" w:type="dxa"/>
-            <w:bottom w:w="0" w:type="dxa"/>
-          </w:tblCellMar>
-        </w:tblPrEx>
         <w:tc>
           <w:tcPr>
             <w:tcW w:w="2520" w:type="dxa"/>
@@ -17389,12 +16904,6 @@
         <w:gridCol w:w="6840"/>
       </w:tblGrid>
       <w:tr>
-        <w:tblPrEx>
-          <w:tblCellMar>
-            <w:top w:w="0" w:type="dxa"/>
-            <w:bottom w:w="0" w:type="dxa"/>
-          </w:tblCellMar>
-        </w:tblPrEx>
         <w:tc>
           <w:tcPr>
             <w:tcW w:w="2520" w:type="dxa"/>
@@ -17454,12 +16963,6 @@
         </w:tc>
       </w:tr>
       <w:tr>
-        <w:tblPrEx>
-          <w:tblCellMar>
-            <w:top w:w="0" w:type="dxa"/>
-            <w:bottom w:w="0" w:type="dxa"/>
-          </w:tblCellMar>
-        </w:tblPrEx>
         <w:tc>
           <w:tcPr>
             <w:tcW w:w="2520" w:type="dxa"/>
@@ -17593,12 +17096,6 @@
         </w:tc>
       </w:tr>
       <w:tr>
-        <w:tblPrEx>
-          <w:tblCellMar>
-            <w:top w:w="0" w:type="dxa"/>
-            <w:bottom w:w="0" w:type="dxa"/>
-          </w:tblCellMar>
-        </w:tblPrEx>
         <w:tc>
           <w:tcPr>
             <w:tcW w:w="2520" w:type="dxa"/>
@@ -17696,12 +17193,6 @@
         </w:tc>
       </w:tr>
       <w:tr>
-        <w:tblPrEx>
-          <w:tblCellMar>
-            <w:top w:w="0" w:type="dxa"/>
-            <w:bottom w:w="0" w:type="dxa"/>
-          </w:tblCellMar>
-        </w:tblPrEx>
         <w:tc>
           <w:tcPr>
             <w:tcW w:w="2520" w:type="dxa"/>
@@ -17807,12 +17298,6 @@
         </w:tc>
       </w:tr>
       <w:tr>
-        <w:tblPrEx>
-          <w:tblCellMar>
-            <w:top w:w="0" w:type="dxa"/>
-            <w:bottom w:w="0" w:type="dxa"/>
-          </w:tblCellMar>
-        </w:tblPrEx>
         <w:tc>
           <w:tcPr>
             <w:tcW w:w="2520" w:type="dxa"/>
@@ -17882,12 +17367,6 @@
         </w:tc>
       </w:tr>
       <w:tr>
-        <w:tblPrEx>
-          <w:tblCellMar>
-            <w:top w:w="0" w:type="dxa"/>
-            <w:bottom w:w="0" w:type="dxa"/>
-          </w:tblCellMar>
-        </w:tblPrEx>
         <w:tc>
           <w:tcPr>
             <w:tcW w:w="2520" w:type="dxa"/>
@@ -18011,12 +17490,6 @@
         </w:tc>
       </w:tr>
       <w:tr>
-        <w:tblPrEx>
-          <w:tblCellMar>
-            <w:top w:w="0" w:type="dxa"/>
-            <w:bottom w:w="0" w:type="dxa"/>
-          </w:tblCellMar>
-        </w:tblPrEx>
         <w:tc>
           <w:tcPr>
             <w:tcW w:w="2520" w:type="dxa"/>
@@ -18123,12 +17596,6 @@
         </w:tc>
       </w:tr>
       <w:tr>
-        <w:tblPrEx>
-          <w:tblCellMar>
-            <w:top w:w="0" w:type="dxa"/>
-            <w:bottom w:w="0" w:type="dxa"/>
-          </w:tblCellMar>
-        </w:tblPrEx>
         <w:tc>
           <w:tcPr>
             <w:tcW w:w="2520" w:type="dxa"/>
@@ -18198,12 +17665,6 @@
         </w:tc>
       </w:tr>
       <w:tr>
-        <w:tblPrEx>
-          <w:tblCellMar>
-            <w:top w:w="0" w:type="dxa"/>
-            <w:bottom w:w="0" w:type="dxa"/>
-          </w:tblCellMar>
-        </w:tblPrEx>
         <w:tc>
           <w:tcPr>
             <w:tcW w:w="2520" w:type="dxa"/>
@@ -18309,12 +17770,6 @@
         </w:tc>
       </w:tr>
       <w:tr>
-        <w:tblPrEx>
-          <w:tblCellMar>
-            <w:top w:w="0" w:type="dxa"/>
-            <w:bottom w:w="0" w:type="dxa"/>
-          </w:tblCellMar>
-        </w:tblPrEx>
         <w:tc>
           <w:tcPr>
             <w:tcW w:w="2520" w:type="dxa"/>
@@ -18430,12 +17885,6 @@
         </w:tc>
       </w:tr>
       <w:tr>
-        <w:tblPrEx>
-          <w:tblCellMar>
-            <w:top w:w="0" w:type="dxa"/>
-            <w:bottom w:w="0" w:type="dxa"/>
-          </w:tblCellMar>
-        </w:tblPrEx>
         <w:tc>
           <w:tcPr>
             <w:tcW w:w="2520" w:type="dxa"/>
@@ -18569,12 +18018,6 @@
         </w:tc>
       </w:tr>
       <w:tr>
-        <w:tblPrEx>
-          <w:tblCellMar>
-            <w:top w:w="0" w:type="dxa"/>
-            <w:bottom w:w="0" w:type="dxa"/>
-          </w:tblCellMar>
-        </w:tblPrEx>
         <w:tc>
           <w:tcPr>
             <w:tcW w:w="2520" w:type="dxa"/>
@@ -18644,12 +18087,6 @@
         </w:tc>
       </w:tr>
       <w:tr>
-        <w:tblPrEx>
-          <w:tblCellMar>
-            <w:top w:w="0" w:type="dxa"/>
-            <w:bottom w:w="0" w:type="dxa"/>
-          </w:tblCellMar>
-        </w:tblPrEx>
         <w:tc>
           <w:tcPr>
             <w:tcW w:w="2520" w:type="dxa"/>
@@ -18737,12 +18174,6 @@
         </w:tc>
       </w:tr>
       <w:tr>
-        <w:tblPrEx>
-          <w:tblCellMar>
-            <w:top w:w="0" w:type="dxa"/>
-            <w:bottom w:w="0" w:type="dxa"/>
-          </w:tblCellMar>
-        </w:tblPrEx>
         <w:tc>
           <w:tcPr>
             <w:tcW w:w="2520" w:type="dxa"/>
@@ -18812,12 +18243,6 @@
         </w:tc>
       </w:tr>
       <w:tr>
-        <w:tblPrEx>
-          <w:tblCellMar>
-            <w:top w:w="0" w:type="dxa"/>
-            <w:bottom w:w="0" w:type="dxa"/>
-          </w:tblCellMar>
-        </w:tblPrEx>
         <w:tc>
           <w:tcPr>
             <w:tcW w:w="2520" w:type="dxa"/>
@@ -18887,12 +18312,6 @@
         </w:tc>
       </w:tr>
       <w:tr>
-        <w:tblPrEx>
-          <w:tblCellMar>
-            <w:top w:w="0" w:type="dxa"/>
-            <w:bottom w:w="0" w:type="dxa"/>
-          </w:tblCellMar>
-        </w:tblPrEx>
         <w:tc>
           <w:tcPr>
             <w:tcW w:w="2520" w:type="dxa"/>
@@ -18980,12 +18399,6 @@
         </w:tc>
       </w:tr>
       <w:tr>
-        <w:tblPrEx>
-          <w:tblCellMar>
-            <w:top w:w="0" w:type="dxa"/>
-            <w:bottom w:w="0" w:type="dxa"/>
-          </w:tblCellMar>
-        </w:tblPrEx>
         <w:tc>
           <w:tcPr>
             <w:tcW w:w="2520" w:type="dxa"/>
@@ -19119,12 +18532,6 @@
         </w:tc>
       </w:tr>
       <w:tr>
-        <w:tblPrEx>
-          <w:tblCellMar>
-            <w:top w:w="0" w:type="dxa"/>
-            <w:bottom w:w="0" w:type="dxa"/>
-          </w:tblCellMar>
-        </w:tblPrEx>
         <w:tc>
           <w:tcPr>
             <w:tcW w:w="2520" w:type="dxa"/>
@@ -19212,12 +18619,6 @@
         </w:tc>
       </w:tr>
       <w:tr>
-        <w:tblPrEx>
-          <w:tblCellMar>
-            <w:top w:w="0" w:type="dxa"/>
-            <w:bottom w:w="0" w:type="dxa"/>
-          </w:tblCellMar>
-        </w:tblPrEx>
         <w:tc>
           <w:tcPr>
             <w:tcW w:w="2520" w:type="dxa"/>
@@ -19377,12 +18778,6 @@
         </w:tc>
       </w:tr>
       <w:tr>
-        <w:tblPrEx>
-          <w:tblCellMar>
-            <w:top w:w="0" w:type="dxa"/>
-            <w:bottom w:w="0" w:type="dxa"/>
-          </w:tblCellMar>
-        </w:tblPrEx>
         <w:tc>
           <w:tcPr>
             <w:tcW w:w="2520" w:type="dxa"/>
@@ -19506,12 +18901,6 @@
         </w:tc>
       </w:tr>
       <w:tr>
-        <w:tblPrEx>
-          <w:tblCellMar>
-            <w:top w:w="0" w:type="dxa"/>
-            <w:bottom w:w="0" w:type="dxa"/>
-          </w:tblCellMar>
-        </w:tblPrEx>
         <w:tc>
           <w:tcPr>
             <w:tcW w:w="2520" w:type="dxa"/>
@@ -19617,12 +19006,6 @@
         </w:tc>
       </w:tr>
       <w:tr>
-        <w:tblPrEx>
-          <w:tblCellMar>
-            <w:top w:w="0" w:type="dxa"/>
-            <w:bottom w:w="0" w:type="dxa"/>
-          </w:tblCellMar>
-        </w:tblPrEx>
         <w:tc>
           <w:tcPr>
             <w:tcW w:w="2520" w:type="dxa"/>
@@ -19692,12 +19075,6 @@
         </w:tc>
       </w:tr>
       <w:tr>
-        <w:tblPrEx>
-          <w:tblCellMar>
-            <w:top w:w="0" w:type="dxa"/>
-            <w:bottom w:w="0" w:type="dxa"/>
-          </w:tblCellMar>
-        </w:tblPrEx>
         <w:tc>
           <w:tcPr>
             <w:tcW w:w="2520" w:type="dxa"/>
@@ -19785,12 +19162,6 @@
         </w:tc>
       </w:tr>
       <w:tr>
-        <w:tblPrEx>
-          <w:tblCellMar>
-            <w:top w:w="0" w:type="dxa"/>
-            <w:bottom w:w="0" w:type="dxa"/>
-          </w:tblCellMar>
-        </w:tblPrEx>
         <w:tc>
           <w:tcPr>
             <w:tcW w:w="2520" w:type="dxa"/>
@@ -19924,12 +19295,6 @@
         </w:tc>
       </w:tr>
       <w:tr>
-        <w:tblPrEx>
-          <w:tblCellMar>
-            <w:top w:w="0" w:type="dxa"/>
-            <w:bottom w:w="0" w:type="dxa"/>
-          </w:tblCellMar>
-        </w:tblPrEx>
         <w:tc>
           <w:tcPr>
             <w:tcW w:w="2520" w:type="dxa"/>
@@ -20035,12 +19400,6 @@
         </w:tc>
       </w:tr>
       <w:tr>
-        <w:tblPrEx>
-          <w:tblCellMar>
-            <w:top w:w="0" w:type="dxa"/>
-            <w:bottom w:w="0" w:type="dxa"/>
-          </w:tblCellMar>
-        </w:tblPrEx>
         <w:tc>
           <w:tcPr>
             <w:tcW w:w="2520" w:type="dxa"/>
@@ -20128,12 +19487,6 @@
         </w:tc>
       </w:tr>
       <w:tr>
-        <w:tblPrEx>
-          <w:tblCellMar>
-            <w:top w:w="0" w:type="dxa"/>
-            <w:bottom w:w="0" w:type="dxa"/>
-          </w:tblCellMar>
-        </w:tblPrEx>
         <w:tc>
           <w:tcPr>
             <w:tcW w:w="2520" w:type="dxa"/>
@@ -20258,12 +19611,6 @@
         </w:tc>
       </w:tr>
       <w:tr>
-        <w:tblPrEx>
-          <w:tblCellMar>
-            <w:top w:w="0" w:type="dxa"/>
-            <w:bottom w:w="0" w:type="dxa"/>
-          </w:tblCellMar>
-        </w:tblPrEx>
         <w:tc>
           <w:tcPr>
             <w:tcW w:w="2520" w:type="dxa"/>
@@ -20369,12 +19716,6 @@
         <w:gridCol w:w="6840"/>
       </w:tblGrid>
       <w:tr>
-        <w:tblPrEx>
-          <w:tblCellMar>
-            <w:top w:w="0" w:type="dxa"/>
-            <w:bottom w:w="0" w:type="dxa"/>
-          </w:tblCellMar>
-        </w:tblPrEx>
         <w:tc>
           <w:tcPr>
             <w:tcW w:w="2520" w:type="dxa"/>
@@ -20434,12 +19775,6 @@
         </w:tc>
       </w:tr>
       <w:tr>
-        <w:tblPrEx>
-          <w:tblCellMar>
-            <w:top w:w="0" w:type="dxa"/>
-            <w:bottom w:w="0" w:type="dxa"/>
-          </w:tblCellMar>
-        </w:tblPrEx>
         <w:tc>
           <w:tcPr>
             <w:tcW w:w="2520" w:type="dxa"/>
@@ -20527,12 +19862,6 @@
         </w:tc>
       </w:tr>
       <w:tr>
-        <w:tblPrEx>
-          <w:tblCellMar>
-            <w:top w:w="0" w:type="dxa"/>
-            <w:bottom w:w="0" w:type="dxa"/>
-          </w:tblCellMar>
-        </w:tblPrEx>
         <w:tc>
           <w:tcPr>
             <w:tcW w:w="2520" w:type="dxa"/>
@@ -20602,12 +19931,6 @@
         </w:tc>
       </w:tr>
       <w:tr>
-        <w:tblPrEx>
-          <w:tblCellMar>
-            <w:top w:w="0" w:type="dxa"/>
-            <w:bottom w:w="0" w:type="dxa"/>
-          </w:tblCellMar>
-        </w:tblPrEx>
         <w:tc>
           <w:tcPr>
             <w:tcW w:w="2520" w:type="dxa"/>
@@ -20770,12 +20093,6 @@
         <w:gridCol w:w="7200"/>
       </w:tblGrid>
       <w:tr>
-        <w:tblPrEx>
-          <w:tblCellMar>
-            <w:top w:w="0" w:type="dxa"/>
-            <w:bottom w:w="0" w:type="dxa"/>
-          </w:tblCellMar>
-        </w:tblPrEx>
         <w:tc>
           <w:tcPr>
             <w:tcW w:w="2160" w:type="dxa"/>
@@ -20835,12 +20152,6 @@
         </w:tc>
       </w:tr>
       <w:tr>
-        <w:tblPrEx>
-          <w:tblCellMar>
-            <w:top w:w="0" w:type="dxa"/>
-            <w:bottom w:w="0" w:type="dxa"/>
-          </w:tblCellMar>
-        </w:tblPrEx>
         <w:tc>
           <w:tcPr>
             <w:tcW w:w="2160" w:type="dxa"/>
@@ -20936,12 +20247,6 @@
         </w:tc>
       </w:tr>
       <w:tr>
-        <w:tblPrEx>
-          <w:tblCellMar>
-            <w:top w:w="0" w:type="dxa"/>
-            <w:bottom w:w="0" w:type="dxa"/>
-          </w:tblCellMar>
-        </w:tblPrEx>
         <w:tc>
           <w:tcPr>
             <w:tcW w:w="2160" w:type="dxa"/>
@@ -21001,12 +20306,6 @@
         </w:tc>
       </w:tr>
       <w:tr>
-        <w:tblPrEx>
-          <w:tblCellMar>
-            <w:top w:w="0" w:type="dxa"/>
-            <w:bottom w:w="0" w:type="dxa"/>
-          </w:tblCellMar>
-        </w:tblPrEx>
         <w:tc>
           <w:tcPr>
             <w:tcW w:w="2160" w:type="dxa"/>
@@ -21084,12 +20383,6 @@
         </w:tc>
       </w:tr>
       <w:tr>
-        <w:tblPrEx>
-          <w:tblCellMar>
-            <w:top w:w="0" w:type="dxa"/>
-            <w:bottom w:w="0" w:type="dxa"/>
-          </w:tblCellMar>
-        </w:tblPrEx>
         <w:tc>
           <w:tcPr>
             <w:tcW w:w="2160" w:type="dxa"/>
@@ -21185,12 +20478,6 @@
         </w:tc>
       </w:tr>
       <w:tr>
-        <w:tblPrEx>
-          <w:tblCellMar>
-            <w:top w:w="0" w:type="dxa"/>
-            <w:bottom w:w="0" w:type="dxa"/>
-          </w:tblCellMar>
-        </w:tblPrEx>
         <w:tc>
           <w:tcPr>
             <w:tcW w:w="2160" w:type="dxa"/>
@@ -21250,12 +20537,6 @@
         </w:tc>
       </w:tr>
       <w:tr>
-        <w:tblPrEx>
-          <w:tblCellMar>
-            <w:top w:w="0" w:type="dxa"/>
-            <w:bottom w:w="0" w:type="dxa"/>
-          </w:tblCellMar>
-        </w:tblPrEx>
         <w:tc>
           <w:tcPr>
             <w:tcW w:w="2160" w:type="dxa"/>
@@ -21369,12 +20650,6 @@
         </w:tc>
       </w:tr>
       <w:tr>
-        <w:tblPrEx>
-          <w:tblCellMar>
-            <w:top w:w="0" w:type="dxa"/>
-            <w:bottom w:w="0" w:type="dxa"/>
-          </w:tblCellMar>
-        </w:tblPrEx>
         <w:tc>
           <w:tcPr>
             <w:tcW w:w="2160" w:type="dxa"/>
@@ -21434,12 +20709,6 @@
         </w:tc>
       </w:tr>
       <w:tr>
-        <w:tblPrEx>
-          <w:tblCellMar>
-            <w:top w:w="0" w:type="dxa"/>
-            <w:bottom w:w="0" w:type="dxa"/>
-          </w:tblCellMar>
-        </w:tblPrEx>
         <w:tc>
           <w:tcPr>
             <w:tcW w:w="2160" w:type="dxa"/>
@@ -21499,12 +20768,6 @@
         </w:tc>
       </w:tr>
       <w:tr>
-        <w:tblPrEx>
-          <w:tblCellMar>
-            <w:top w:w="0" w:type="dxa"/>
-            <w:bottom w:w="0" w:type="dxa"/>
-          </w:tblCellMar>
-        </w:tblPrEx>
         <w:tc>
           <w:tcPr>
             <w:tcW w:w="2160" w:type="dxa"/>
@@ -21564,12 +20827,6 @@
         </w:tc>
       </w:tr>
       <w:tr>
-        <w:tblPrEx>
-          <w:tblCellMar>
-            <w:top w:w="0" w:type="dxa"/>
-            <w:bottom w:w="0" w:type="dxa"/>
-          </w:tblCellMar>
-        </w:tblPrEx>
         <w:tc>
           <w:tcPr>
             <w:tcW w:w="2160" w:type="dxa"/>
@@ -21629,12 +20886,6 @@
         </w:tc>
       </w:tr>
       <w:tr>
-        <w:tblPrEx>
-          <w:tblCellMar>
-            <w:top w:w="0" w:type="dxa"/>
-            <w:bottom w:w="0" w:type="dxa"/>
-          </w:tblCellMar>
-        </w:tblPrEx>
         <w:tc>
           <w:tcPr>
             <w:tcW w:w="2160" w:type="dxa"/>
@@ -21694,12 +20945,6 @@
         </w:tc>
       </w:tr>
       <w:tr>
-        <w:tblPrEx>
-          <w:tblCellMar>
-            <w:top w:w="0" w:type="dxa"/>
-            <w:bottom w:w="0" w:type="dxa"/>
-          </w:tblCellMar>
-        </w:tblPrEx>
         <w:tc>
           <w:tcPr>
             <w:tcW w:w="2160" w:type="dxa"/>
@@ -21759,12 +21004,6 @@
         </w:tc>
       </w:tr>
       <w:tr>
-        <w:tblPrEx>
-          <w:tblCellMar>
-            <w:top w:w="0" w:type="dxa"/>
-            <w:bottom w:w="0" w:type="dxa"/>
-          </w:tblCellMar>
-        </w:tblPrEx>
         <w:tc>
           <w:tcPr>
             <w:tcW w:w="2160" w:type="dxa"/>
@@ -21852,12 +21091,6 @@
         </w:tc>
       </w:tr>
       <w:tr>
-        <w:tblPrEx>
-          <w:tblCellMar>
-            <w:top w:w="0" w:type="dxa"/>
-            <w:bottom w:w="0" w:type="dxa"/>
-          </w:tblCellMar>
-        </w:tblPrEx>
         <w:tc>
           <w:tcPr>
             <w:tcW w:w="2160" w:type="dxa"/>
@@ -21953,12 +21186,6 @@
         </w:tc>
       </w:tr>
       <w:tr>
-        <w:tblPrEx>
-          <w:tblCellMar>
-            <w:top w:w="0" w:type="dxa"/>
-            <w:bottom w:w="0" w:type="dxa"/>
-          </w:tblCellMar>
-        </w:tblPrEx>
         <w:tc>
           <w:tcPr>
             <w:tcW w:w="2160" w:type="dxa"/>
@@ -22018,12 +21245,6 @@
         </w:tc>
       </w:tr>
       <w:tr>
-        <w:tblPrEx>
-          <w:tblCellMar>
-            <w:top w:w="0" w:type="dxa"/>
-            <w:bottom w:w="0" w:type="dxa"/>
-          </w:tblCellMar>
-        </w:tblPrEx>
         <w:tc>
           <w:tcPr>
             <w:tcW w:w="2160" w:type="dxa"/>
@@ -22084,12 +21305,6 @@
         </w:tc>
       </w:tr>
       <w:tr>
-        <w:tblPrEx>
-          <w:tblCellMar>
-            <w:top w:w="0" w:type="dxa"/>
-            <w:bottom w:w="0" w:type="dxa"/>
-          </w:tblCellMar>
-        </w:tblPrEx>
         <w:tc>
           <w:tcPr>
             <w:tcW w:w="2160" w:type="dxa"/>
@@ -22149,12 +21364,6 @@
         </w:tc>
       </w:tr>
       <w:tr>
-        <w:tblPrEx>
-          <w:tblCellMar>
-            <w:top w:w="0" w:type="dxa"/>
-            <w:bottom w:w="0" w:type="dxa"/>
-          </w:tblCellMar>
-        </w:tblPrEx>
         <w:tc>
           <w:tcPr>
             <w:tcW w:w="2160" w:type="dxa"/>
@@ -22214,12 +21423,6 @@
         </w:tc>
       </w:tr>
       <w:tr>
-        <w:tblPrEx>
-          <w:tblCellMar>
-            <w:top w:w="0" w:type="dxa"/>
-            <w:bottom w:w="0" w:type="dxa"/>
-          </w:tblCellMar>
-        </w:tblPrEx>
         <w:tc>
           <w:tcPr>
             <w:tcW w:w="2160" w:type="dxa"/>
@@ -22279,12 +21482,6 @@
         </w:tc>
       </w:tr>
       <w:tr>
-        <w:tblPrEx>
-          <w:tblCellMar>
-            <w:top w:w="0" w:type="dxa"/>
-            <w:bottom w:w="0" w:type="dxa"/>
-          </w:tblCellMar>
-        </w:tblPrEx>
         <w:tc>
           <w:tcPr>
             <w:tcW w:w="2160" w:type="dxa"/>
@@ -22362,12 +21559,6 @@
         </w:tc>
       </w:tr>
       <w:tr>
-        <w:tblPrEx>
-          <w:tblCellMar>
-            <w:top w:w="0" w:type="dxa"/>
-            <w:bottom w:w="0" w:type="dxa"/>
-          </w:tblCellMar>
-        </w:tblPrEx>
         <w:tc>
           <w:tcPr>
             <w:tcW w:w="2160" w:type="dxa"/>
@@ -23393,12 +22584,6 @@
         <w:gridCol w:w="6240"/>
       </w:tblGrid>
       <w:tr>
-        <w:tblPrEx>
-          <w:tblCellMar>
-            <w:top w:w="0" w:type="dxa"/>
-            <w:bottom w:w="0" w:type="dxa"/>
-          </w:tblCellMar>
-        </w:tblPrEx>
         <w:tc>
           <w:tcPr>
             <w:tcW w:w="3120" w:type="dxa"/>
@@ -23458,12 +22643,6 @@
         </w:tc>
       </w:tr>
       <w:tr>
-        <w:tblPrEx>
-          <w:tblCellMar>
-            <w:top w:w="0" w:type="dxa"/>
-            <w:bottom w:w="0" w:type="dxa"/>
-          </w:tblCellMar>
-        </w:tblPrEx>
         <w:tc>
           <w:tcPr>
             <w:tcW w:w="3120" w:type="dxa"/>
@@ -23559,12 +22738,6 @@
         </w:tc>
       </w:tr>
       <w:tr>
-        <w:tblPrEx>
-          <w:tblCellMar>
-            <w:top w:w="0" w:type="dxa"/>
-            <w:bottom w:w="0" w:type="dxa"/>
-          </w:tblCellMar>
-        </w:tblPrEx>
         <w:tc>
           <w:tcPr>
             <w:tcW w:w="3120" w:type="dxa"/>
@@ -23624,12 +22797,6 @@
         </w:tc>
       </w:tr>
       <w:tr>
-        <w:tblPrEx>
-          <w:tblCellMar>
-            <w:top w:w="0" w:type="dxa"/>
-            <w:bottom w:w="0" w:type="dxa"/>
-          </w:tblCellMar>
-        </w:tblPrEx>
         <w:tc>
           <w:tcPr>
             <w:tcW w:w="3120" w:type="dxa"/>
@@ -23689,12 +22856,6 @@
         </w:tc>
       </w:tr>
       <w:tr>
-        <w:tblPrEx>
-          <w:tblCellMar>
-            <w:top w:w="0" w:type="dxa"/>
-            <w:bottom w:w="0" w:type="dxa"/>
-          </w:tblCellMar>
-        </w:tblPrEx>
         <w:tc>
           <w:tcPr>
             <w:tcW w:w="3120" w:type="dxa"/>
@@ -23772,12 +22933,6 @@
         </w:tc>
       </w:tr>
       <w:tr>
-        <w:tblPrEx>
-          <w:tblCellMar>
-            <w:top w:w="0" w:type="dxa"/>
-            <w:bottom w:w="0" w:type="dxa"/>
-          </w:tblCellMar>
-        </w:tblPrEx>
         <w:tc>
           <w:tcPr>
             <w:tcW w:w="3120" w:type="dxa"/>
@@ -23873,12 +23028,6 @@
         </w:tc>
       </w:tr>
       <w:tr>
-        <w:tblPrEx>
-          <w:tblCellMar>
-            <w:top w:w="0" w:type="dxa"/>
-            <w:bottom w:w="0" w:type="dxa"/>
-          </w:tblCellMar>
-        </w:tblPrEx>
         <w:tc>
           <w:tcPr>
             <w:tcW w:w="3120" w:type="dxa"/>
@@ -23974,12 +23123,6 @@
         </w:tc>
       </w:tr>
       <w:tr>
-        <w:tblPrEx>
-          <w:tblCellMar>
-            <w:top w:w="0" w:type="dxa"/>
-            <w:bottom w:w="0" w:type="dxa"/>
-          </w:tblCellMar>
-        </w:tblPrEx>
         <w:tc>
           <w:tcPr>
             <w:tcW w:w="3120" w:type="dxa"/>
@@ -24078,8 +23221,6 @@
         <w:lastRenderedPageBreak/>
         <w:t>README -</w:t>
       </w:r>
-      <w:bookmarkStart w:id="0" w:name="_GoBack"/>
-      <w:bookmarkEnd w:id="0"/>
       <w:r>
         <w:t xml:space="preserve"> Installation Guide</w:t>
       </w:r>
@@ -24432,7 +23573,15 @@
         <w:rPr>
           <w:color w:val="2C1A0E"/>
         </w:rPr>
-        <w:t xml:space="preserve">/ folder to any static web host. No build step or server-side runtime is required. Recommended hosts: </w:t>
+        <w:t>/ folder to any static web host. No build step or server-side runtime is required. R</w:t>
+      </w:r>
+      <w:bookmarkStart w:id="0" w:name="_GoBack"/>
+      <w:bookmarkEnd w:id="0"/>
+      <w:r>
+        <w:rPr>
+          <w:color w:val="2C1A0E"/>
+        </w:rPr>
+        <w:t xml:space="preserve">ecommended hosts: </w:t>
       </w:r>
       <w:proofErr w:type="spellStart"/>
       <w:r>

</xml_diff>